<commit_message>
adding day 12, day 13 assignments
</commit_message>
<xml_diff>
--- a/angular/day12/day12-content/Day 4_Lab Assignment (1).docx
+++ b/angular/day12/day12-content/Day 4_Lab Assignment (1).docx
@@ -145,41 +145,13 @@
           <w:szCs w:val="24"/>
         </w:rPr>
       </w:pPr>
-      <w:proofErr w:type="spellStart"/>
-      <w:r>
-        <w:rPr>
-          <w:rFonts w:asciiTheme="majorBidi" w:hAnsiTheme="majorBidi" w:cstheme="majorBidi"/>
-          <w:sz w:val="24"/>
-          <w:szCs w:val="24"/>
-        </w:rPr>
-        <w:t>getProductsByCatID</w:t>
-      </w:r>
-      <w:proofErr w:type="spellEnd"/>
-      <w:r>
-        <w:rPr>
-          <w:rFonts w:asciiTheme="majorBidi" w:hAnsiTheme="majorBidi" w:cstheme="majorBidi"/>
-          <w:sz w:val="24"/>
-          <w:szCs w:val="24"/>
-        </w:rPr>
-        <w:t>(</w:t>
-      </w:r>
-      <w:proofErr w:type="spellStart"/>
-      <w:r>
-        <w:rPr>
-          <w:rFonts w:asciiTheme="majorBidi" w:hAnsiTheme="majorBidi" w:cstheme="majorBidi"/>
-          <w:sz w:val="24"/>
-          <w:szCs w:val="24"/>
-        </w:rPr>
-        <w:t>catID</w:t>
-      </w:r>
-      <w:proofErr w:type="spellEnd"/>
-      <w:r>
-        <w:rPr>
-          <w:rFonts w:asciiTheme="majorBidi" w:hAnsiTheme="majorBidi" w:cstheme="majorBidi"/>
-          <w:sz w:val="24"/>
-          <w:szCs w:val="24"/>
-        </w:rPr>
-        <w:t>): Products []</w:t>
+      <w:r>
+        <w:rPr>
+          <w:rFonts w:asciiTheme="majorBidi" w:hAnsiTheme="majorBidi" w:cstheme="majorBidi"/>
+          <w:sz w:val="24"/>
+          <w:szCs w:val="24"/>
+        </w:rPr>
+        <w:t>getProductsByCatID(catID): Products []</w:t>
       </w:r>
     </w:p>
     <w:p>
@@ -196,41 +168,13 @@
           <w:szCs w:val="24"/>
         </w:rPr>
       </w:pPr>
-      <w:proofErr w:type="spellStart"/>
-      <w:r>
-        <w:rPr>
-          <w:rFonts w:asciiTheme="majorBidi" w:hAnsiTheme="majorBidi" w:cstheme="majorBidi"/>
-          <w:sz w:val="24"/>
-          <w:szCs w:val="24"/>
-        </w:rPr>
-        <w:t>getProductByID</w:t>
-      </w:r>
-      <w:proofErr w:type="spellEnd"/>
-      <w:r>
-        <w:rPr>
-          <w:rFonts w:asciiTheme="majorBidi" w:hAnsiTheme="majorBidi" w:cstheme="majorBidi"/>
-          <w:sz w:val="24"/>
-          <w:szCs w:val="24"/>
-        </w:rPr>
-        <w:t>(</w:t>
-      </w:r>
-      <w:proofErr w:type="spellStart"/>
-      <w:r>
-        <w:rPr>
-          <w:rFonts w:asciiTheme="majorBidi" w:hAnsiTheme="majorBidi" w:cstheme="majorBidi"/>
-          <w:sz w:val="24"/>
-          <w:szCs w:val="24"/>
-        </w:rPr>
-        <w:t>prodID</w:t>
-      </w:r>
-      <w:proofErr w:type="spellEnd"/>
-      <w:r>
-        <w:rPr>
-          <w:rFonts w:asciiTheme="majorBidi" w:hAnsiTheme="majorBidi" w:cstheme="majorBidi"/>
-          <w:sz w:val="24"/>
-          <w:szCs w:val="24"/>
-        </w:rPr>
-        <w:t>): Product</w:t>
+      <w:r>
+        <w:rPr>
+          <w:rFonts w:asciiTheme="majorBidi" w:hAnsiTheme="majorBidi" w:cstheme="majorBidi"/>
+          <w:sz w:val="24"/>
+          <w:szCs w:val="24"/>
+        </w:rPr>
+        <w:t>getProductByID(prodID): Product</w:t>
       </w:r>
     </w:p>
     <w:p>
@@ -255,7 +199,6 @@
         </w:rPr>
         <w:t xml:space="preserve">What’s the meaning of </w:t>
       </w:r>
-      <w:proofErr w:type="spellStart"/>
       <w:proofErr w:type="gramStart"/>
       <w:r>
         <w:rPr>
@@ -263,16 +206,7 @@
           <w:sz w:val="24"/>
           <w:szCs w:val="24"/>
         </w:rPr>
-        <w:t>ProvidedIn</w:t>
-      </w:r>
-      <w:proofErr w:type="spellEnd"/>
-      <w:r>
-        <w:rPr>
-          <w:rFonts w:asciiTheme="majorBidi" w:hAnsiTheme="majorBidi" w:cstheme="majorBidi"/>
-          <w:sz w:val="24"/>
-          <w:szCs w:val="24"/>
-        </w:rPr>
-        <w:t>: ‘</w:t>
+        <w:t>ProvidedIn: ‘</w:t>
       </w:r>
       <w:proofErr w:type="gramEnd"/>
       <w:r>
@@ -332,29 +266,7 @@
           <w:sz w:val="24"/>
           <w:szCs w:val="24"/>
         </w:rPr>
-        <w:t xml:space="preserve">“A service becomes singleton when we apply </w:t>
-      </w:r>
-      <w:proofErr w:type="spellStart"/>
-      <w:r>
-        <w:rPr>
-          <w:rFonts w:asciiTheme="majorBidi" w:hAnsiTheme="majorBidi" w:cstheme="majorBidi"/>
-          <w:i/>
-          <w:iCs/>
-          <w:sz w:val="24"/>
-          <w:szCs w:val="24"/>
-        </w:rPr>
-        <w:t>providedIn</w:t>
-      </w:r>
-      <w:proofErr w:type="spellEnd"/>
-      <w:r>
-        <w:rPr>
-          <w:rFonts w:asciiTheme="majorBidi" w:hAnsiTheme="majorBidi" w:cstheme="majorBidi"/>
-          <w:i/>
-          <w:iCs/>
-          <w:sz w:val="24"/>
-          <w:szCs w:val="24"/>
-        </w:rPr>
-        <w:t xml:space="preserve"> property of @Injectable decorator or Declare service in the providers’ array of @ngModule”</w:t>
+        <w:t>“A service becomes singleton when we apply providedIn property of @Injectable decorator or Declare service in the providers’ array of @ngModule”</w:t>
       </w:r>
     </w:p>
     <w:p>
@@ -395,19 +307,8 @@
           <w:sz w:val="24"/>
           <w:szCs w:val="24"/>
         </w:rPr>
-        <w:t xml:space="preserve"> the Providers of specific Module or component? </w:t>
-      </w:r>
-      <w:proofErr w:type="gramStart"/>
-      <w:r>
-        <w:rPr>
-          <w:rFonts w:asciiTheme="majorBidi" w:hAnsiTheme="majorBidi" w:cstheme="majorBidi"/>
-          <w:sz w:val="24"/>
-          <w:szCs w:val="24"/>
-        </w:rPr>
-        <w:t>How?(</w:t>
-      </w:r>
-      <w:proofErr w:type="spellStart"/>
-      <w:proofErr w:type="gramEnd"/>
+        <w:t xml:space="preserve"> the Providers of specific Module or component? How?(</w:t>
+      </w:r>
       <w:r>
         <w:rPr>
           <w:rFonts w:asciiTheme="majorBidi" w:hAnsiTheme="majorBidi" w:cstheme="majorBidi"/>
@@ -417,7 +318,6 @@
         </w:rPr>
         <w:t>Bouns</w:t>
       </w:r>
-      <w:proofErr w:type="spellEnd"/>
       <w:r>
         <w:rPr>
           <w:rFonts w:asciiTheme="majorBidi" w:hAnsiTheme="majorBidi" w:cstheme="majorBidi"/>
@@ -684,25 +584,7 @@
           <w:sz w:val="24"/>
           <w:szCs w:val="24"/>
         </w:rPr>
-        <w:t xml:space="preserve">A Component to handle any wrong routes that when user writes a route that </w:t>
-      </w:r>
-      <w:proofErr w:type="gramStart"/>
-      <w:r>
-        <w:rPr>
-          <w:rFonts w:asciiTheme="majorBidi" w:hAnsiTheme="majorBidi" w:cstheme="majorBidi"/>
-          <w:sz w:val="24"/>
-          <w:szCs w:val="24"/>
-        </w:rPr>
-        <w:t>isn’t exist (Wildcard route)</w:t>
-      </w:r>
-      <w:proofErr w:type="gramEnd"/>
-      <w:r>
-        <w:rPr>
-          <w:rFonts w:asciiTheme="majorBidi" w:hAnsiTheme="majorBidi" w:cstheme="majorBidi"/>
-          <w:sz w:val="24"/>
-          <w:szCs w:val="24"/>
-        </w:rPr>
-        <w:t>.</w:t>
+        <w:t>A Component to handle any wrong routes that when user writes a route that isn’t exist (Wildcard route).</w:t>
       </w:r>
     </w:p>
     <w:p>
@@ -725,38 +607,8 @@
           <w:sz w:val="24"/>
           <w:szCs w:val="24"/>
         </w:rPr>
-        <w:t xml:space="preserve">Add your </w:t>
-      </w:r>
-      <w:proofErr w:type="gramStart"/>
-      <w:r>
-        <w:rPr>
-          <w:rFonts w:asciiTheme="majorBidi" w:hAnsiTheme="majorBidi" w:cstheme="majorBidi"/>
-          <w:sz w:val="24"/>
-          <w:szCs w:val="24"/>
-        </w:rPr>
-        <w:t>routes to routes</w:t>
-      </w:r>
-      <w:proofErr w:type="gramEnd"/>
-      <w:r>
-        <w:rPr>
-          <w:rFonts w:asciiTheme="majorBidi" w:hAnsiTheme="majorBidi" w:cstheme="majorBidi"/>
-          <w:sz w:val="24"/>
-          <w:szCs w:val="24"/>
-        </w:rPr>
-        <w:t xml:space="preserve"> variable in app-</w:t>
-      </w:r>
-      <w:proofErr w:type="spellStart"/>
-      <w:proofErr w:type="gramStart"/>
-      <w:r>
-        <w:rPr>
-          <w:rFonts w:asciiTheme="majorBidi" w:hAnsiTheme="majorBidi" w:cstheme="majorBidi"/>
-          <w:sz w:val="24"/>
-          <w:szCs w:val="24"/>
-        </w:rPr>
-        <w:t>routing.module</w:t>
-      </w:r>
-      <w:proofErr w:type="spellEnd"/>
-      <w:proofErr w:type="gramEnd"/>
+        <w:t>Add your routes to routes variable in app-routing.module</w:t>
+      </w:r>
       <w:r>
         <w:rPr>
           <w:rFonts w:asciiTheme="majorBidi" w:hAnsiTheme="majorBidi" w:cstheme="majorBidi"/>
@@ -914,25 +766,7 @@
           <w:sz w:val="24"/>
           <w:szCs w:val="24"/>
         </w:rPr>
-        <w:t xml:space="preserve">Change the links and add </w:t>
-      </w:r>
-      <w:proofErr w:type="spellStart"/>
-      <w:r>
-        <w:rPr>
-          <w:rFonts w:asciiTheme="majorBidi" w:hAnsiTheme="majorBidi" w:cstheme="majorBidi"/>
-          <w:sz w:val="24"/>
-          <w:szCs w:val="24"/>
-        </w:rPr>
-        <w:t>routerLink</w:t>
-      </w:r>
-      <w:proofErr w:type="spellEnd"/>
-      <w:r>
-        <w:rPr>
-          <w:rFonts w:asciiTheme="majorBidi" w:hAnsiTheme="majorBidi" w:cstheme="majorBidi"/>
-          <w:sz w:val="24"/>
-          <w:szCs w:val="24"/>
-        </w:rPr>
-        <w:t xml:space="preserve"> attribute.</w:t>
+        <w:t>Change the links and add routerLink attribute.</w:t>
       </w:r>
     </w:p>
     <w:p>
@@ -955,18 +789,8 @@
           <w:sz w:val="24"/>
           <w:szCs w:val="24"/>
         </w:rPr>
-        <w:t xml:space="preserve">In all links add </w:t>
-      </w:r>
-      <w:proofErr w:type="spellStart"/>
-      <w:r>
-        <w:rPr>
-          <w:rFonts w:asciiTheme="majorBidi" w:hAnsiTheme="majorBidi" w:cstheme="majorBidi"/>
-          <w:sz w:val="24"/>
-          <w:szCs w:val="24"/>
-        </w:rPr>
-        <w:t>RouterLinkActive</w:t>
-      </w:r>
-      <w:proofErr w:type="spellEnd"/>
+        <w:t>In all links add RouterLinkActive</w:t>
+      </w:r>
     </w:p>
     <w:p>
       <w:pPr>
@@ -1065,25 +889,7 @@
           <w:sz w:val="24"/>
           <w:szCs w:val="24"/>
         </w:rPr>
-        <w:t xml:space="preserve">In your Shopping Cart component, add a button ‘details’ in front of each product, that navigates to the </w:t>
-      </w:r>
-      <w:proofErr w:type="gramStart"/>
-      <w:r>
-        <w:rPr>
-          <w:rFonts w:asciiTheme="majorBidi" w:hAnsiTheme="majorBidi" w:cstheme="majorBidi"/>
-          <w:sz w:val="24"/>
-          <w:szCs w:val="24"/>
-        </w:rPr>
-        <w:t>route: ‘</w:t>
-      </w:r>
-      <w:proofErr w:type="gramEnd"/>
-      <w:r>
-        <w:rPr>
-          <w:rFonts w:asciiTheme="majorBidi" w:hAnsiTheme="majorBidi" w:cstheme="majorBidi"/>
-          <w:sz w:val="24"/>
-          <w:szCs w:val="24"/>
-        </w:rPr>
-        <w:t>product/:id’.</w:t>
+        <w:t>In your Shopping Cart component, add a button ‘details’ in front of each product, that navigates to the route: ‘product/:id’.</w:t>
       </w:r>
     </w:p>
     <w:p>
@@ -1132,23 +938,13 @@
           <w:szCs w:val="24"/>
         </w:rPr>
       </w:pPr>
-      <w:proofErr w:type="gramStart"/>
-      <w:r>
-        <w:rPr>
-          <w:rFonts w:asciiTheme="majorBidi" w:hAnsiTheme="majorBidi" w:cstheme="majorBidi"/>
-          <w:sz w:val="24"/>
-          <w:szCs w:val="24"/>
-        </w:rPr>
-        <w:t>navigate(</w:t>
-      </w:r>
-      <w:proofErr w:type="gramEnd"/>
-      <w:r>
-        <w:rPr>
-          <w:rFonts w:asciiTheme="majorBidi" w:hAnsiTheme="majorBidi" w:cstheme="majorBidi"/>
-          <w:sz w:val="24"/>
-          <w:szCs w:val="24"/>
-        </w:rPr>
-        <w:t>) function in router service, return a promise, try it to print any message in the console after the navigation is completed.</w:t>
+      <w:r>
+        <w:rPr>
+          <w:rFonts w:asciiTheme="majorBidi" w:hAnsiTheme="majorBidi" w:cstheme="majorBidi"/>
+          <w:sz w:val="24"/>
+          <w:szCs w:val="24"/>
+        </w:rPr>
+        <w:t>navigate() function in router service, return a promise, try it to print any message in the console after the navigation is completed.</w:t>
       </w:r>
     </w:p>
     <w:p>
@@ -1171,25 +967,7 @@
           <w:sz w:val="24"/>
           <w:szCs w:val="24"/>
         </w:rPr>
-        <w:t xml:space="preserve">Can you do it by </w:t>
-      </w:r>
-      <w:proofErr w:type="gramStart"/>
-      <w:r>
-        <w:rPr>
-          <w:rFonts w:asciiTheme="majorBidi" w:hAnsiTheme="majorBidi" w:cstheme="majorBidi"/>
-          <w:sz w:val="24"/>
-          <w:szCs w:val="24"/>
-        </w:rPr>
-        <w:t>a link</w:t>
-      </w:r>
-      <w:proofErr w:type="gramEnd"/>
-      <w:r>
-        <w:rPr>
-          <w:rFonts w:asciiTheme="majorBidi" w:hAnsiTheme="majorBidi" w:cstheme="majorBidi"/>
-          <w:sz w:val="24"/>
-          <w:szCs w:val="24"/>
-        </w:rPr>
-        <w:t xml:space="preserve"> instead?</w:t>
+        <w:t>Can you do it by a link instead?</w:t>
       </w:r>
     </w:p>
     <w:p>
@@ -1212,25 +990,7 @@
           <w:sz w:val="24"/>
           <w:szCs w:val="24"/>
         </w:rPr>
-        <w:t xml:space="preserve">Create </w:t>
-      </w:r>
-      <w:proofErr w:type="spellStart"/>
-      <w:r>
-        <w:rPr>
-          <w:rFonts w:asciiTheme="majorBidi" w:hAnsiTheme="majorBidi" w:cstheme="majorBidi"/>
-          <w:sz w:val="24"/>
-          <w:szCs w:val="24"/>
-        </w:rPr>
-        <w:t>ProductDetails</w:t>
-      </w:r>
-      <w:proofErr w:type="spellEnd"/>
-      <w:r>
-        <w:rPr>
-          <w:rFonts w:asciiTheme="majorBidi" w:hAnsiTheme="majorBidi" w:cstheme="majorBidi"/>
-          <w:sz w:val="24"/>
-          <w:szCs w:val="24"/>
-        </w:rPr>
-        <w:t xml:space="preserve"> Component, that receives an id and display the given product details.</w:t>
+        <w:t>Create ProductDetails Component, that receives an id and display the given product details.</w:t>
       </w:r>
     </w:p>
     <w:p>
@@ -1253,25 +1013,7 @@
           <w:sz w:val="24"/>
           <w:szCs w:val="24"/>
         </w:rPr>
-        <w:t xml:space="preserve">In the </w:t>
-      </w:r>
-      <w:proofErr w:type="spellStart"/>
-      <w:r>
-        <w:rPr>
-          <w:rFonts w:asciiTheme="majorBidi" w:hAnsiTheme="majorBidi" w:cstheme="majorBidi"/>
-          <w:sz w:val="24"/>
-          <w:szCs w:val="24"/>
-        </w:rPr>
-        <w:t>ProductDetails</w:t>
-      </w:r>
-      <w:proofErr w:type="spellEnd"/>
-      <w:r>
-        <w:rPr>
-          <w:rFonts w:asciiTheme="majorBidi" w:hAnsiTheme="majorBidi" w:cstheme="majorBidi"/>
-          <w:sz w:val="24"/>
-          <w:szCs w:val="24"/>
-        </w:rPr>
-        <w:t xml:space="preserve"> Component, get the sent ID, and display the given product details.</w:t>
+        <w:t>In the ProductDetails Component, get the sent ID, and display the given product details.</w:t>
       </w:r>
     </w:p>
     <w:p>
@@ -1302,18 +1044,8 @@
           <w:sz w:val="24"/>
           <w:szCs w:val="24"/>
         </w:rPr>
-        <w:t xml:space="preserve"> need to use </w:t>
-      </w:r>
-      <w:proofErr w:type="spellStart"/>
-      <w:r>
-        <w:rPr>
-          <w:rFonts w:asciiTheme="majorBidi" w:hAnsiTheme="majorBidi" w:cstheme="majorBidi"/>
-          <w:sz w:val="24"/>
-          <w:szCs w:val="24"/>
-        </w:rPr>
-        <w:t>ActivatedRoute</w:t>
-      </w:r>
-      <w:proofErr w:type="spellEnd"/>
+        <w:t xml:space="preserve"> need to use ActivatedRoute</w:t>
+      </w:r>
       <w:r>
         <w:rPr>
           <w:rFonts w:asciiTheme="majorBidi" w:hAnsiTheme="majorBidi" w:cstheme="majorBidi"/>
@@ -1405,35 +1137,7 @@
         <w:rPr>
           <w:rFonts w:asciiTheme="majorBidi" w:hAnsiTheme="majorBidi" w:cstheme="majorBidi"/>
         </w:rPr>
-        <w:t xml:space="preserve">Create </w:t>
-      </w:r>
-      <w:proofErr w:type="gramStart"/>
-      <w:r>
-        <w:rPr>
-          <w:rFonts w:asciiTheme="majorBidi" w:hAnsiTheme="majorBidi" w:cstheme="majorBidi"/>
-        </w:rPr>
-        <w:t>new</w:t>
-      </w:r>
-      <w:proofErr w:type="gramEnd"/>
-      <w:r>
-        <w:rPr>
-          <w:rFonts w:asciiTheme="majorBidi" w:hAnsiTheme="majorBidi" w:cstheme="majorBidi"/>
-        </w:rPr>
-        <w:t xml:space="preserve"> service (</w:t>
-      </w:r>
-      <w:proofErr w:type="spellStart"/>
-      <w:r>
-        <w:rPr>
-          <w:rFonts w:asciiTheme="majorBidi" w:hAnsiTheme="majorBidi" w:cstheme="majorBidi"/>
-        </w:rPr>
-        <w:t>UserAuthService</w:t>
-      </w:r>
-      <w:proofErr w:type="spellEnd"/>
-      <w:r>
-        <w:rPr>
-          <w:rFonts w:asciiTheme="majorBidi" w:hAnsiTheme="majorBidi" w:cstheme="majorBidi"/>
-        </w:rPr>
-        <w:t>), that has methods:</w:t>
+        <w:t>Create new service (UserAuthService), that has methods:</w:t>
       </w:r>
     </w:p>
     <w:p>
@@ -1446,6 +1150,25 @@
           <w:szCs w:val="24"/>
         </w:rPr>
       </w:pPr>
+    </w:p>
+    <w:p>
+      <w:pPr>
+        <w:pStyle w:val="ListParagraph"/>
+        <w:jc w:val="both"/>
+        <w:rPr>
+          <w:rFonts w:asciiTheme="majorBidi" w:hAnsiTheme="majorBidi" w:cstheme="majorBidi"/>
+          <w:sz w:val="24"/>
+          <w:szCs w:val="24"/>
+        </w:rPr>
+      </w:pPr>
+      <w:r>
+        <w:rPr>
+          <w:rFonts w:asciiTheme="majorBidi" w:hAnsiTheme="majorBidi" w:cstheme="majorBidi"/>
+          <w:sz w:val="24"/>
+          <w:szCs w:val="24"/>
+        </w:rPr>
+        <w:t>https://chatgpt.com/share/6a65ed46-5e24-83ea-a288-3852134e1865</w:t>
+      </w:r>
     </w:p>
     <w:sectPr>
       <w:headerReference w:type="default" r:id="rId11"/>
@@ -4393,26 +4116,6 @@
 </file>
 
 <file path=customXml/item1.xml><?xml version="1.0" encoding="utf-8"?>
-<p:properties xmlns:p="http://schemas.microsoft.com/office/2006/metadata/properties" xmlns:xsi="http://www.w3.org/2001/XMLSchema-instance" xmlns:pc="http://schemas.microsoft.com/office/infopath/2007/PartnerControls">
-  <documentManagement>
-    <TaxCatchAll xmlns="53f9fcf5-1486-426e-b8d3-ce7def6356f0" xsi:nil="true"/>
-    <lcf76f155ced4ddcb4097134ff3c332f xmlns="97be5517-c571-4c78-9c92-450474ca01ae">
-      <Terms xmlns="http://schemas.microsoft.com/office/infopath/2007/PartnerControls"/>
-    </lcf76f155ced4ddcb4097134ff3c332f>
-  </documentManagement>
-</p:properties>
-</file>
-
-<file path=customXml/item2.xml><?xml version="1.0" encoding="utf-8"?>
-<?mso-contentType ?>
-<FormTemplates xmlns="http://schemas.microsoft.com/sharepoint/v3/contenttype/forms">
-  <Display>DocumentLibraryForm</Display>
-  <Edit>DocumentLibraryForm</Edit>
-  <New>DocumentLibraryForm</New>
-</FormTemplates>
-</file>
-
-<file path=customXml/item3.xml><?xml version="1.0" encoding="utf-8"?>
 <ct:contentTypeSchema xmlns:ct="http://schemas.microsoft.com/office/2006/metadata/contentType" xmlns:ma="http://schemas.microsoft.com/office/2006/metadata/properties/metaAttributes" ct:_="" ma:_="" ma:contentTypeName="Document" ma:contentTypeID="0x010100962846A4520E7A47AA2DA4786148611F" ma:contentTypeVersion="12" ma:contentTypeDescription="Create a new document." ma:contentTypeScope="" ma:versionID="e8ef63e639c77595db7c1010c48afcdb">
   <xsd:schema xmlns:xsd="http://www.w3.org/2001/XMLSchema" xmlns:xs="http://www.w3.org/2001/XMLSchema" xmlns:p="http://schemas.microsoft.com/office/2006/metadata/properties" xmlns:ns2="97be5517-c571-4c78-9c92-450474ca01ae" xmlns:ns3="53f9fcf5-1486-426e-b8d3-ce7def6356f0" targetNamespace="http://schemas.microsoft.com/office/2006/metadata/properties" ma:root="true" ma:fieldsID="6c5e7780c669952f92bf626696d59190" ns2:_="" ns3:_="">
     <xsd:import namespace="97be5517-c571-4c78-9c92-450474ca01ae"/>
@@ -4613,26 +4316,27 @@
 </ct:contentTypeSchema>
 </file>
 
-<file path=customXml/itemProps1.xml><?xml version="1.0" encoding="utf-8"?>
-<ds:datastoreItem xmlns:ds="http://schemas.openxmlformats.org/officeDocument/2006/customXml" ds:itemID="{DCF84E4A-8FC2-441A-85A0-A19112169088}">
-  <ds:schemaRefs>
-    <ds:schemaRef ds:uri="http://schemas.microsoft.com/office/2006/metadata/properties"/>
-    <ds:schemaRef ds:uri="http://schemas.microsoft.com/office/infopath/2007/PartnerControls"/>
-    <ds:schemaRef ds:uri="53f9fcf5-1486-426e-b8d3-ce7def6356f0"/>
-    <ds:schemaRef ds:uri="97be5517-c571-4c78-9c92-450474ca01ae"/>
-  </ds:schemaRefs>
-</ds:datastoreItem>
+<file path=customXml/item2.xml><?xml version="1.0" encoding="utf-8"?>
+<?mso-contentType ?>
+<FormTemplates xmlns="http://schemas.microsoft.com/sharepoint/v3/contenttype/forms">
+  <Display>DocumentLibraryForm</Display>
+  <Edit>DocumentLibraryForm</Edit>
+  <New>DocumentLibraryForm</New>
+</FormTemplates>
 </file>
 
-<file path=customXml/itemProps2.xml><?xml version="1.0" encoding="utf-8"?>
-<ds:datastoreItem xmlns:ds="http://schemas.openxmlformats.org/officeDocument/2006/customXml" ds:itemID="{6B918EAB-06C2-4169-8803-0A89CB45CDCA}">
-  <ds:schemaRefs>
-    <ds:schemaRef ds:uri="http://schemas.microsoft.com/sharepoint/v3/contenttype/forms"/>
-  </ds:schemaRefs>
-</ds:datastoreItem>
+<file path=customXml/item3.xml><?xml version="1.0" encoding="utf-8"?>
+<p:properties xmlns:p="http://schemas.microsoft.com/office/2006/metadata/properties" xmlns:xsi="http://www.w3.org/2001/XMLSchema-instance" xmlns:pc="http://schemas.microsoft.com/office/infopath/2007/PartnerControls">
+  <documentManagement>
+    <TaxCatchAll xmlns="53f9fcf5-1486-426e-b8d3-ce7def6356f0" xsi:nil="true"/>
+    <lcf76f155ced4ddcb4097134ff3c332f xmlns="97be5517-c571-4c78-9c92-450474ca01ae">
+      <Terms xmlns="http://schemas.microsoft.com/office/infopath/2007/PartnerControls"/>
+    </lcf76f155ced4ddcb4097134ff3c332f>
+  </documentManagement>
+</p:properties>
 </file>
 
-<file path=customXml/itemProps3.xml><?xml version="1.0" encoding="utf-8"?>
+<file path=customXml/itemProps1.xml><?xml version="1.0" encoding="utf-8"?>
 <ds:datastoreItem xmlns:ds="http://schemas.openxmlformats.org/officeDocument/2006/customXml" ds:itemID="{EAE4E81F-0913-44A4-B093-A7A36A05737D}">
   <ds:schemaRefs>
     <ds:schemaRef ds:uri="http://schemas.microsoft.com/office/2006/metadata/contentType"/>
@@ -4649,4 +4353,23 @@
     <ds:schemaRef ds:uri="http://schemas.microsoft.com/internal/obd"/>
   </ds:schemaRefs>
 </ds:datastoreItem>
+</file>
+
+<file path=customXml/itemProps2.xml><?xml version="1.0" encoding="utf-8"?>
+<ds:datastoreItem xmlns:ds="http://schemas.openxmlformats.org/officeDocument/2006/customXml" ds:itemID="{6B918EAB-06C2-4169-8803-0A89CB45CDCA}">
+  <ds:schemaRefs>
+    <ds:schemaRef ds:uri="http://schemas.microsoft.com/sharepoint/v3/contenttype/forms"/>
+  </ds:schemaRefs>
+</ds:datastoreItem>
+</file>
+
+<file path=customXml/itemProps3.xml><?xml version="1.0" encoding="utf-8"?>
+<ds:datastoreItem xmlns:ds="http://schemas.openxmlformats.org/officeDocument/2006/customXml" ds:itemID="{DCF84E4A-8FC2-441A-85A0-A19112169088}">
+  <ds:schemaRefs>
+    <ds:schemaRef ds:uri="http://schemas.microsoft.com/office/2006/metadata/properties"/>
+    <ds:schemaRef ds:uri="http://schemas.microsoft.com/office/infopath/2007/PartnerControls"/>
+    <ds:schemaRef ds:uri="53f9fcf5-1486-426e-b8d3-ce7def6356f0"/>
+    <ds:schemaRef ds:uri="97be5517-c571-4c78-9c92-450474ca01ae"/>
+  </ds:schemaRefs>
+</ds:datastoreItem>
 </file>
</xml_diff>

<commit_message>
solving assignment of day 12
</commit_message>
<xml_diff>
--- a/angular/day12/day12-content/Day 4_Lab Assignment (1).docx
+++ b/angular/day12/day12-content/Day 4_Lab Assignment (1).docx
@@ -197,43 +197,7 @@
           <w:sz w:val="24"/>
           <w:szCs w:val="24"/>
         </w:rPr>
-        <w:t xml:space="preserve">What’s the meaning of </w:t>
-      </w:r>
-      <w:proofErr w:type="gramStart"/>
-      <w:r>
-        <w:rPr>
-          <w:rFonts w:asciiTheme="majorBidi" w:hAnsiTheme="majorBidi" w:cstheme="majorBidi"/>
-          <w:sz w:val="24"/>
-          <w:szCs w:val="24"/>
-        </w:rPr>
-        <w:t>ProvidedIn: ‘</w:t>
-      </w:r>
-      <w:proofErr w:type="gramEnd"/>
-      <w:r>
-        <w:rPr>
-          <w:rFonts w:asciiTheme="majorBidi" w:hAnsiTheme="majorBidi" w:cstheme="majorBidi"/>
-          <w:sz w:val="24"/>
-          <w:szCs w:val="24"/>
-        </w:rPr>
-        <w:t xml:space="preserve">root’, in the </w:t>
-      </w:r>
-      <w:proofErr w:type="gramStart"/>
-      <w:r>
-        <w:rPr>
-          <w:rFonts w:asciiTheme="majorBidi" w:hAnsiTheme="majorBidi" w:cstheme="majorBidi"/>
-          <w:sz w:val="24"/>
-          <w:szCs w:val="24"/>
-        </w:rPr>
-        <w:t>service @</w:t>
-      </w:r>
-      <w:proofErr w:type="gramEnd"/>
-      <w:r>
-        <w:rPr>
-          <w:rFonts w:asciiTheme="majorBidi" w:hAnsiTheme="majorBidi" w:cstheme="majorBidi"/>
-          <w:sz w:val="24"/>
-          <w:szCs w:val="24"/>
-        </w:rPr>
-        <w:t xml:space="preserve">injectable function? </w:t>
+        <w:t xml:space="preserve">What’s the meaning of ProvidedIn: ‘root’, in the service @injectable function? </w:t>
       </w:r>
     </w:p>
     <w:p>
@@ -289,25 +253,7 @@
           <w:sz w:val="24"/>
           <w:szCs w:val="24"/>
         </w:rPr>
-        <w:t xml:space="preserve">Can you instead add it </w:t>
-      </w:r>
-      <w:proofErr w:type="gramStart"/>
-      <w:r>
-        <w:rPr>
-          <w:rFonts w:asciiTheme="majorBidi" w:hAnsiTheme="majorBidi" w:cstheme="majorBidi"/>
-          <w:sz w:val="24"/>
-          <w:szCs w:val="24"/>
-        </w:rPr>
-        <w:t>in</w:t>
-      </w:r>
-      <w:proofErr w:type="gramEnd"/>
-      <w:r>
-        <w:rPr>
-          <w:rFonts w:asciiTheme="majorBidi" w:hAnsiTheme="majorBidi" w:cstheme="majorBidi"/>
-          <w:sz w:val="24"/>
-          <w:szCs w:val="24"/>
-        </w:rPr>
-        <w:t xml:space="preserve"> the Providers of specific Module or component? How?(</w:t>
+        <w:t>Can you instead add it in the Providers of specific Module or component? How?(</w:t>
       </w:r>
       <w:r>
         <w:rPr>
@@ -638,23 +584,7 @@
           <w:sz w:val="24"/>
           <w:szCs w:val="24"/>
         </w:rPr>
-        <w:t>Is t</w:t>
-      </w:r>
-      <w:r>
-        <w:rPr>
-          <w:rFonts w:asciiTheme="majorBidi" w:hAnsiTheme="majorBidi" w:cstheme="majorBidi"/>
-          <w:sz w:val="24"/>
-          <w:szCs w:val="24"/>
-        </w:rPr>
-        <w:t>he order of the routes in the configuration matters</w:t>
-      </w:r>
-      <w:r>
-        <w:rPr>
-          <w:rFonts w:asciiTheme="majorBidi" w:hAnsiTheme="majorBidi" w:cstheme="majorBidi"/>
-          <w:sz w:val="24"/>
-          <w:szCs w:val="24"/>
-        </w:rPr>
-        <w:t>?</w:t>
+        <w:t>Is the order of the routes in the configuration matters?</w:t>
       </w:r>
       <w:r>
         <w:rPr>
@@ -712,15 +642,7 @@
           <w:sz w:val="24"/>
           <w:szCs w:val="24"/>
         </w:rPr>
-        <w:t xml:space="preserve"> when matching routes</w:t>
-      </w:r>
-      <w:r>
-        <w:rPr>
-          <w:rFonts w:asciiTheme="majorBidi" w:hAnsiTheme="majorBidi" w:cstheme="majorBidi"/>
-          <w:sz w:val="24"/>
-          <w:szCs w:val="24"/>
-        </w:rPr>
-        <w:t>, explain that?</w:t>
+        <w:t xml:space="preserve"> when matching routes, explain that?</w:t>
       </w:r>
     </w:p>
     <w:p>
@@ -3662,6 +3584,9 @@
     <w:name w:val="Normal"/>
     <w:qFormat/>
     <w:rsid w:val="005A0EF4"/>
+    <w:rPr>
+      <w:noProof/>
+    </w:rPr>
   </w:style>
   <w:style w:type="character" w:default="1" w:styleId="DefaultParagraphFont">
     <w:name w:val="Default Paragraph Font"/>
@@ -4116,6 +4041,15 @@
 </file>
 
 <file path=customXml/item1.xml><?xml version="1.0" encoding="utf-8"?>
+<?mso-contentType ?>
+<FormTemplates xmlns="http://schemas.microsoft.com/sharepoint/v3/contenttype/forms">
+  <Display>DocumentLibraryForm</Display>
+  <Edit>DocumentLibraryForm</Edit>
+  <New>DocumentLibraryForm</New>
+</FormTemplates>
+</file>
+
+<file path=customXml/item2.xml><?xml version="1.0" encoding="utf-8"?>
 <ct:contentTypeSchema xmlns:ct="http://schemas.microsoft.com/office/2006/metadata/contentType" xmlns:ma="http://schemas.microsoft.com/office/2006/metadata/properties/metaAttributes" ct:_="" ma:_="" ma:contentTypeName="Document" ma:contentTypeID="0x010100962846A4520E7A47AA2DA4786148611F" ma:contentTypeVersion="12" ma:contentTypeDescription="Create a new document." ma:contentTypeScope="" ma:versionID="e8ef63e639c77595db7c1010c48afcdb">
   <xsd:schema xmlns:xsd="http://www.w3.org/2001/XMLSchema" xmlns:xs="http://www.w3.org/2001/XMLSchema" xmlns:p="http://schemas.microsoft.com/office/2006/metadata/properties" xmlns:ns2="97be5517-c571-4c78-9c92-450474ca01ae" xmlns:ns3="53f9fcf5-1486-426e-b8d3-ce7def6356f0" targetNamespace="http://schemas.microsoft.com/office/2006/metadata/properties" ma:root="true" ma:fieldsID="6c5e7780c669952f92bf626696d59190" ns2:_="" ns3:_="">
     <xsd:import namespace="97be5517-c571-4c78-9c92-450474ca01ae"/>
@@ -4316,15 +4250,6 @@
 </ct:contentTypeSchema>
 </file>
 
-<file path=customXml/item2.xml><?xml version="1.0" encoding="utf-8"?>
-<?mso-contentType ?>
-<FormTemplates xmlns="http://schemas.microsoft.com/sharepoint/v3/contenttype/forms">
-  <Display>DocumentLibraryForm</Display>
-  <Edit>DocumentLibraryForm</Edit>
-  <New>DocumentLibraryForm</New>
-</FormTemplates>
-</file>
-
 <file path=customXml/item3.xml><?xml version="1.0" encoding="utf-8"?>
 <p:properties xmlns:p="http://schemas.microsoft.com/office/2006/metadata/properties" xmlns:xsi="http://www.w3.org/2001/XMLSchema-instance" xmlns:pc="http://schemas.microsoft.com/office/infopath/2007/PartnerControls">
   <documentManagement>
@@ -4337,6 +4262,14 @@
 </file>
 
 <file path=customXml/itemProps1.xml><?xml version="1.0" encoding="utf-8"?>
+<ds:datastoreItem xmlns:ds="http://schemas.openxmlformats.org/officeDocument/2006/customXml" ds:itemID="{6B918EAB-06C2-4169-8803-0A89CB45CDCA}">
+  <ds:schemaRefs>
+    <ds:schemaRef ds:uri="http://schemas.microsoft.com/sharepoint/v3/contenttype/forms"/>
+  </ds:schemaRefs>
+</ds:datastoreItem>
+</file>
+
+<file path=customXml/itemProps2.xml><?xml version="1.0" encoding="utf-8"?>
 <ds:datastoreItem xmlns:ds="http://schemas.openxmlformats.org/officeDocument/2006/customXml" ds:itemID="{EAE4E81F-0913-44A4-B093-A7A36A05737D}">
   <ds:schemaRefs>
     <ds:schemaRef ds:uri="http://schemas.microsoft.com/office/2006/metadata/contentType"/>
@@ -4355,14 +4288,6 @@
 </ds:datastoreItem>
 </file>
 
-<file path=customXml/itemProps2.xml><?xml version="1.0" encoding="utf-8"?>
-<ds:datastoreItem xmlns:ds="http://schemas.openxmlformats.org/officeDocument/2006/customXml" ds:itemID="{6B918EAB-06C2-4169-8803-0A89CB45CDCA}">
-  <ds:schemaRefs>
-    <ds:schemaRef ds:uri="http://schemas.microsoft.com/sharepoint/v3/contenttype/forms"/>
-  </ds:schemaRefs>
-</ds:datastoreItem>
-</file>
-
 <file path=customXml/itemProps3.xml><?xml version="1.0" encoding="utf-8"?>
 <ds:datastoreItem xmlns:ds="http://schemas.openxmlformats.org/officeDocument/2006/customXml" ds:itemID="{DCF84E4A-8FC2-441A-85A0-A19112169088}">
   <ds:schemaRefs>

</xml_diff>